<commit_message>
Final Update: 校對 Sheet 欄位、修正 LIFF ID 與商品清單 UI
</commit_message>
<xml_diff>
--- a/1-Final/操作流程1.docx
+++ b/1-Final/操作流程1.docx
@@ -8856,36 +8856,43 @@
         </w:rPr>
         <w:t>標記</w:t>
       </w:r>
+    </w:p>
+    <w:p>
+      <w:pPr>
+        <w:rPr>
+          <w:b/>
+          <w:bCs/>
+        </w:rPr>
+      </w:pPr>
+      <w:r>
+        <w:rPr>
+          <w:b/>
+          <w:bCs/>
+        </w:rPr>
+        <w:t>LIFF ID</w:t>
+      </w:r>
+      <w:r>
+        <w:rPr>
+          <w:b/>
+          <w:bCs/>
+        </w:rPr>
+        <w:t xml:space="preserve">: </w:t>
+      </w:r>
+      <w:r>
+        <w:rPr>
+          <w:b/>
+          <w:bCs/>
+        </w:rPr>
+        <w:t>2008857998-ePc</w:t>
+      </w:r>
       <w:bookmarkStart w:id="0" w:name="_GoBack"/>
       <w:bookmarkEnd w:id="0"/>
-    </w:p>
-    <w:p>
-      <w:pPr>
-        <w:rPr>
-          <w:b/>
-          <w:bCs/>
-        </w:rPr>
-      </w:pPr>
-      <w:r>
-        <w:rPr>
-          <w:b/>
-          <w:bCs/>
-        </w:rPr>
-        <w:t>LIFF ID</w:t>
-      </w:r>
-      <w:r>
-        <w:rPr>
-          <w:b/>
-          <w:bCs/>
-        </w:rPr>
-        <w:t xml:space="preserve">: </w:t>
-      </w:r>
-      <w:r>
-        <w:rPr>
-          <w:b/>
-          <w:bCs/>
-        </w:rPr>
-        <w:t>2008857998-ePcCkr6K</w:t>
+      <w:r>
+        <w:rPr>
+          <w:b/>
+          <w:bCs/>
+        </w:rPr>
+        <w:t>Ckr6K</w:t>
       </w:r>
     </w:p>
     <w:p>
@@ -9327,7 +9334,7 @@
             <w:b/>
             <w:bCs/>
           </w:rPr>
-          <w:t>https://line-group-buy-bot-api.onrender.com/liff/liff-product-detail.html</w:t>
+          <w:t xml:space="preserve">https://line-group-buy-bot-api.onrender.com/liff/liff-admin-orders.html </w:t>
         </w:r>
       </w:hyperlink>
     </w:p>
@@ -9485,7 +9492,15 @@
             <w:b/>
             <w:bCs/>
           </w:rPr>
-          <w:t>https://line-group-buy-bot-api.onrender.com/liff/liff-admin-overstock-stats.html</w:t>
+          <w:t>https://line-group-buy-bot-api.onrender.com/liff/</w:t>
+        </w:r>
+        <w:r>
+          <w:rPr>
+            <w:rStyle w:val="a3"/>
+            <w:b/>
+            <w:bCs/>
+          </w:rPr>
+          <w:t xml:space="preserve">liff-admin-vendor.html </w:t>
         </w:r>
       </w:hyperlink>
     </w:p>
@@ -16036,7 +16051,7 @@
 </file>
 
 <file path=customXml/itemProps1.xml><?xml version="1.0" encoding="utf-8"?>
-<ds:datastoreItem xmlns:ds="http://schemas.openxmlformats.org/officeDocument/2006/customXml" ds:itemID="{B9285BE1-8196-4FB1-A981-F4AE126B4B1F}">
+<ds:datastoreItem xmlns:ds="http://schemas.openxmlformats.org/officeDocument/2006/customXml" ds:itemID="{3895351B-EF08-46F7-876B-51633BDAB551}">
   <ds:schemaRefs>
     <ds:schemaRef ds:uri="http://schemas.openxmlformats.org/officeDocument/2006/bibliography"/>
   </ds:schemaRefs>

</xml_diff>